<commit_message>
modified the manage template
</commit_message>
<xml_diff>
--- a/backend-templates/manage-plan-saas-agreement.docx
+++ b/backend-templates/manage-plan-saas-agreement.docx
@@ -198,8 +198,13 @@
             <w:pPr>
               <w:jc w:val="center"/>
             </w:pPr>
+            <w:proofErr w:type="gramStart"/>
             <w:r>
-              <w:t>Price(USD)</w:t>
+              <w:t>Price(</w:t>
+            </w:r>
+            <w:proofErr w:type="gramEnd"/>
+            <w:r>
+              <w:t>USD)</w:t>
             </w:r>
           </w:p>
         </w:tc>
@@ -661,7 +666,15 @@
           <w:b/>
           <w:bCs/>
         </w:rPr>
-        <w:t>Initial Service Term:</w:t>
+        <w:t xml:space="preserve">Initial Service </w:t>
+      </w:r>
+      <w:proofErr w:type="gramStart"/>
+      <w:r>
+        <w:rPr>
+          <w:b/>
+          <w:bCs/>
+        </w:rPr>
+        <w:t>Term:</w:t>
       </w:r>
       <w:r>
         <w:t xml:space="preserve"> </w:t>
@@ -670,6 +683,7 @@
         <w:t>{{</w:t>
       </w:r>
       <w:proofErr w:type="spellStart"/>
+      <w:proofErr w:type="gramEnd"/>
       <w:r>
         <w:t>service_start_date</w:t>
       </w:r>
@@ -688,11 +702,16 @@
         <w:t>service_end_date</w:t>
       </w:r>
       <w:proofErr w:type="spellEnd"/>
+      <w:proofErr w:type="gramStart"/>
       <w:r>
         <w:t>}}</w:t>
       </w:r>
       <w:r>
-        <w:t xml:space="preserve">  - </w:t>
+        <w:t xml:space="preserve">  -</w:t>
+      </w:r>
+      <w:proofErr w:type="gramEnd"/>
+      <w:r>
+        <w:t xml:space="preserve"> </w:t>
       </w:r>
       <w:r>
         <w:t>{{</w:t>
@@ -804,7 +823,15 @@
         <w:t>600 Park Offices Dr, suite#LL-52 Durham, NC 27709</w:t>
       </w:r>
       <w:r>
-        <w:t xml:space="preserve"> (“Company”), and the Customer listed above (“Customer”). This Agreement includes and incorporates the above Order Form, In Scope Clouds and Applications, all attachments hereto, as well as the attached Terms and Conditions and contains, among other things, warranty disclaimers, liability limitations and use limitations. There shall be no force or effect to any different terms of any related purchase order or similar form even if signed by the parties after the date</w:t>
+        <w:t xml:space="preserve"> (“Company”), and the Customer listed above (“Customer”). This Agreement includes and incorporates the above Order Form, In Scope Clouds and Applications, all attachments hereto, as well as the attached Terms and Conditions and contains, among other things, warranty disclaimers, liability limitations and use limitations. There shall be no force or effect </w:t>
+      </w:r>
+      <w:proofErr w:type="gramStart"/>
+      <w:r>
+        <w:t>to</w:t>
+      </w:r>
+      <w:proofErr w:type="gramEnd"/>
+      <w:r>
+        <w:t xml:space="preserve"> any different terms of any related purchase order or similar form even if signed by the parties after the date</w:t>
       </w:r>
       <w:r>
         <w:t xml:space="preserve"> </w:t>
@@ -861,8 +888,13 @@
             <w:pPr>
               <w:pStyle w:val="PDParagraphDefault"/>
             </w:pPr>
+            <w:proofErr w:type="gramStart"/>
             <w:r>
-              <w:t>By :     _________________________________</w:t>
+              <w:t>By :</w:t>
+            </w:r>
+            <w:proofErr w:type="gramEnd"/>
+            <w:r>
+              <w:t xml:space="preserve">     _________________________________</w:t>
             </w:r>
           </w:p>
           <w:p>
@@ -887,8 +919,13 @@
             <w:pPr>
               <w:pStyle w:val="PDParagraphDefault"/>
             </w:pPr>
+            <w:proofErr w:type="gramStart"/>
             <w:r>
-              <w:t>Title :   _________________________________</w:t>
+              <w:t>Title :</w:t>
+            </w:r>
+            <w:proofErr w:type="gramEnd"/>
+            <w:r>
+              <w:t xml:space="preserve">   _________________________________</w:t>
             </w:r>
           </w:p>
           <w:p>
@@ -900,8 +937,13 @@
             <w:pPr>
               <w:pStyle w:val="PDParagraphDefault"/>
             </w:pPr>
+            <w:proofErr w:type="gramStart"/>
             <w:r>
-              <w:t>Date :  _________________________________</w:t>
+              <w:t>Date :</w:t>
+            </w:r>
+            <w:proofErr w:type="gramEnd"/>
+            <w:r>
+              <w:t xml:space="preserve">  _________________________________</w:t>
             </w:r>
           </w:p>
         </w:tc>
@@ -962,8 +1004,13 @@
             <w:pPr>
               <w:pStyle w:val="PDParagraphDefault"/>
             </w:pPr>
+            <w:proofErr w:type="gramStart"/>
             <w:r>
-              <w:t>By :     _________________________________</w:t>
+              <w:t>By :</w:t>
+            </w:r>
+            <w:proofErr w:type="gramEnd"/>
+            <w:r>
+              <w:t xml:space="preserve">     _________________________________</w:t>
             </w:r>
           </w:p>
           <w:p>
@@ -988,8 +1035,13 @@
             <w:pPr>
               <w:pStyle w:val="PDParagraphDefault"/>
             </w:pPr>
+            <w:proofErr w:type="gramStart"/>
             <w:r>
-              <w:t>Title :   _________________________________</w:t>
+              <w:t>Title :</w:t>
+            </w:r>
+            <w:proofErr w:type="gramEnd"/>
+            <w:r>
+              <w:t xml:space="preserve">   _________________________________</w:t>
             </w:r>
           </w:p>
           <w:p>
@@ -1001,8 +1053,13 @@
             <w:pPr>
               <w:pStyle w:val="PDParagraphDefault"/>
             </w:pPr>
+            <w:proofErr w:type="gramStart"/>
             <w:r>
-              <w:t>Date :  _________________________________</w:t>
+              <w:t>Date :</w:t>
+            </w:r>
+            <w:proofErr w:type="gramEnd"/>
+            <w:r>
+              <w:t xml:space="preserve">  _________________________________</w:t>
             </w:r>
           </w:p>
           <w:p/>
@@ -1206,7 +1263,103 @@
           <w:sz w:val="24"/>
           <w:szCs w:val="24"/>
         </w:rPr>
-        <w:t>Each party (the “Receiving Party”) understands that the other party (the “Disclosing Party”) has disclosed or may disclose business, technical or financial information relating to the Disclosing Party’s business in connection with this Agreement (hereinafter referred to as “Proprietary Information” of the Disclosing Party). For the avoidance of doubt, Proprietary Information shall not include information acquired from a third party by the newsroom of or other editorial contributors to the Customer. Proprietary Information of Company includes non-public information regarding features, functionality and performance of the Service. Proprietary Information of Customer includes non-public data provided by Customer to Company to enable the provision of the Services (“Customer Data”). The Receiving Party agrees: (i) to take reasonable precautions to protect such Proprietary Information, and (ii) not to use (except in performance of the Services or as otherwise permitted herein) or divulge to any third person any such Proprietary Information. The Disclosing Party agrees that the foregoing shall not apply with respect to any information that the Receiving Party can document (a) is or becomes generally available to the public, or (b) was in its possession or known by it prior to receipt from the Disclosing Party, or (c) was rightfully disclosed to it without restriction by a third party, or (d) was independently developed without use of any Proprietary Information of the Disclosing Party or (e) is required to be disclosed by law. Customer shall own all right, title and interest in and to the Customer Data, as well as any data that is based on or derived from the Customer Data and provided to Customer as part of the Services. Company shall own and retain all right, title and interest in and to (a) the Services and Software, all improvements, enhancements or modifications thereto, (b) any software, applications, inventions or other technology developed in connection with Implementation Services or support, and (c) all intellectual property rights related to any of the foregoing. Notwithstanding anything to the contrary, Company shall have the right to collect and analyze limited metadata relating to the provision, use, and performance of the Services and related systems and technologies. Such metadata may include user email addresses, file and folder names, timestamps, file/folder paths and IDs, and file sizes. This information is collected strictly for the purposes of (i) delivering actionable governance insights and visibility into Customer's SaaS and AI environment, (ii) guiding Customer's use of the platform and informing adoption recommendations to maximize the value of the Services, (iii) monitoring and improving the performance, reliability, and functionality of the Services, and (iv) identifying stale, unused, or anomalous licenses, applications, or access grants to enable remediation and risk reduction.</w:t>
+        <w:t xml:space="preserve">Each party (the “Receiving Party”) understands that the other party (the “Disclosing Party”) has disclosed or may disclose business, technical or financial information relating to the Disclosing Party’s business in connection with this Agreement (hereinafter referred to as “Proprietary Information” of the Disclosing Party). For the avoidance of doubt, Proprietary Information shall not include information acquired from a third party by the newsroom of </w:t>
+      </w:r>
+      <w:proofErr w:type="gramStart"/>
+      <w:r>
+        <w:rPr>
+          <w:sz w:val="24"/>
+          <w:szCs w:val="24"/>
+        </w:rPr>
+        <w:t>or</w:t>
+      </w:r>
+      <w:proofErr w:type="gramEnd"/>
+      <w:r>
+        <w:rPr>
+          <w:sz w:val="24"/>
+          <w:szCs w:val="24"/>
+        </w:rPr>
+        <w:t xml:space="preserve"> other editorial contributors to the Customer. Proprietary Information of Company includes non-public information regarding features, functionality and performance of the Service. Proprietary Information of Customer includes non-public data provided by Customer to Company to enable the provision of the Services (“Customer Data”). The Receiving Party agrees: (i) to take reasonable precautions to protect such Proprietary Information, and (ii) not to use (except in performance of the Services or as otherwise permitted herein) or divulge to any third person any such Proprietary Information. The Disclosing Party agrees that the foregoing shall not apply with respect to any information that the Receiving Party can document (a) is or becomes generally available to the public, or (b) was in its possession or known by it prior to receipt from the Disclosing Party, or (c) was rightfully disclosed to it without restriction by a third party, or (d) was independently developed without use of any Proprietary Information of the Disclosing Party or (e) is required to be disclosed by law. Customer shall own all </w:t>
+      </w:r>
+      <w:proofErr w:type="gramStart"/>
+      <w:r>
+        <w:rPr>
+          <w:sz w:val="24"/>
+          <w:szCs w:val="24"/>
+        </w:rPr>
+        <w:t>right</w:t>
+      </w:r>
+      <w:proofErr w:type="gramEnd"/>
+      <w:r>
+        <w:rPr>
+          <w:sz w:val="24"/>
+          <w:szCs w:val="24"/>
+        </w:rPr>
+        <w:t xml:space="preserve">, </w:t>
+      </w:r>
+      <w:proofErr w:type="gramStart"/>
+      <w:r>
+        <w:rPr>
+          <w:sz w:val="24"/>
+          <w:szCs w:val="24"/>
+        </w:rPr>
+        <w:t>title</w:t>
+      </w:r>
+      <w:proofErr w:type="gramEnd"/>
+      <w:r>
+        <w:rPr>
+          <w:sz w:val="24"/>
+          <w:szCs w:val="24"/>
+        </w:rPr>
+        <w:t xml:space="preserve"> and </w:t>
+      </w:r>
+      <w:proofErr w:type="gramStart"/>
+      <w:r>
+        <w:rPr>
+          <w:sz w:val="24"/>
+          <w:szCs w:val="24"/>
+        </w:rPr>
+        <w:t>interest</w:t>
+      </w:r>
+      <w:proofErr w:type="gramEnd"/>
+      <w:r>
+        <w:rPr>
+          <w:sz w:val="24"/>
+          <w:szCs w:val="24"/>
+        </w:rPr>
+        <w:t xml:space="preserve"> in and </w:t>
+      </w:r>
+      <w:proofErr w:type="gramStart"/>
+      <w:r>
+        <w:rPr>
+          <w:sz w:val="24"/>
+          <w:szCs w:val="24"/>
+        </w:rPr>
+        <w:t>to the</w:t>
+      </w:r>
+      <w:proofErr w:type="gramEnd"/>
+      <w:r>
+        <w:rPr>
+          <w:sz w:val="24"/>
+          <w:szCs w:val="24"/>
+        </w:rPr>
+        <w:t xml:space="preserve"> Customer Data, as well as any data that is based on or derived from the Customer Data and provided to Customer as part of the Services. Company shall own and retain all </w:t>
+      </w:r>
+      <w:proofErr w:type="gramStart"/>
+      <w:r>
+        <w:rPr>
+          <w:sz w:val="24"/>
+          <w:szCs w:val="24"/>
+        </w:rPr>
+        <w:t>right</w:t>
+      </w:r>
+      <w:proofErr w:type="gramEnd"/>
+      <w:r>
+        <w:rPr>
+          <w:sz w:val="24"/>
+          <w:szCs w:val="24"/>
+        </w:rPr>
+        <w:t>, title and interest in and to (a) the Services and Software, all improvements, enhancements or modifications thereto, (b) any software, applications, inventions or other technology developed in connection with Implementation Services or support, and (c) all intellectual property rights related to any of the foregoing. Notwithstanding anything to the contrary, Company shall have the right to collect and analyze limited metadata relating to the provision, use, and performance of the Services and related systems and technologies. Such metadata may include user email addresses, file and folder names, timestamps, file/folder paths and IDs, and file sizes. This information is collected strictly for the purposes of (i) delivering actionable governance insights and visibility into Customer's SaaS and AI environment, (ii) guiding Customer's use of the platform and informing adoption recommendations to maximize the value of the Services, (iii) monitoring and improving the performance, reliability, and functionality of the Services, and (iv) identifying stale, unused, or anomalous licenses, applications, or access grants to enable remediation and risk reduction.</w:t>
       </w:r>
     </w:p>
     <w:p>
@@ -1224,7 +1377,23 @@
           <w:szCs w:val="24"/>
         </w:rPr>
         <w:lastRenderedPageBreak/>
-        <w:t>All such metadata will be stored securely in the assigned project server for the duration of the engagement. Upon project completion, and following client approval, Company will decommission the assigned instance and permanently delete all collected metadata. A formal data clearance certificate will be provided to the client confirming the deletion.</w:t>
+        <w:t xml:space="preserve">All such metadata will be stored securely </w:t>
+      </w:r>
+      <w:proofErr w:type="gramStart"/>
+      <w:r>
+        <w:rPr>
+          <w:sz w:val="24"/>
+          <w:szCs w:val="24"/>
+        </w:rPr>
+        <w:t>in</w:t>
+      </w:r>
+      <w:proofErr w:type="gramEnd"/>
+      <w:r>
+        <w:rPr>
+          <w:sz w:val="24"/>
+          <w:szCs w:val="24"/>
+        </w:rPr>
+        <w:t xml:space="preserve"> the assigned project server for the duration of the engagement. Upon project completion, and following client approval, Company will decommission the assigned instance and permanently delete all collected metadata. A formal data clearance certificate will be provided to the client confirming the deletion.</w:t>
       </w:r>
     </w:p>
     <w:p>
@@ -1341,7 +1510,39 @@
           <w:sz w:val="24"/>
           <w:szCs w:val="24"/>
         </w:rPr>
-        <w:t>Customer will pay Company the then applicable fees described in the Order Form for the Services and Implementation Services in accordance with the terms therein (the “Fees”). If Customer’s use of the Services exceeds the Service Capacity set forth on the Order Form or otherwise requires the payment of additional fees (per the terms of this Agreement), Customer shall be billed for such usage and Customer agrees to pay the additional fees in the manner provided herein. Company reserves the right to change the Fees or applicable charges and to institute new charges and Fees at the end of the Initial Service Term or then-current renewal term, upon thirty (30) days prior notice to Customer (which may be sent by email). If Customer believes that Company has billed Customer incorrectly, Customer must contact Company no later than 60 days after the closing date on the first billing statement in which the error or problem appeared, in order to receive an adjustment or credit. Inquiries should be directed to Company’s customer support department. Company may choose to bill through an invoice, in which case, full payment for invoices issued in any given month must be received by Company thirty (30) days after the mailing date of the invoice. Unpaid amounts are subject to a finance charge of 1.5% per month on any outstanding balance, or the maximum permitted by law, whichever is lower, plus all expenses of collection and may result in immediate termination of Service. Customer shall be responsible for all taxes associated with Services other than U.S. taxes based on Company’s net income.</w:t>
+        <w:t xml:space="preserve">Customer will pay Company the then applicable fees described in the Order Form for the Services and Implementation Services in accordance with the terms therein (the “Fees”). If Customer’s use of the Services exceeds the Service Capacity set forth on the Order Form or otherwise requires the payment of additional fees (per the terms of this Agreement), Customer shall be billed for such usage and Customer agrees to pay the additional fees in the manner provided herein. Company reserves the right to change the Fees or applicable charges and to institute new charges and Fees at the end of the Initial Service Term or then-current renewal term, upon thirty (30) days prior notice to Customer (which may be sent by email). If Customer believes that Company has billed Customer incorrectly, Customer must contact Company no later than 60 days after the closing date on the first billing statement in which the error or problem appeared, </w:t>
+      </w:r>
+      <w:proofErr w:type="gramStart"/>
+      <w:r>
+        <w:rPr>
+          <w:sz w:val="24"/>
+          <w:szCs w:val="24"/>
+        </w:rPr>
+        <w:t>in order to</w:t>
+      </w:r>
+      <w:proofErr w:type="gramEnd"/>
+      <w:r>
+        <w:rPr>
+          <w:sz w:val="24"/>
+          <w:szCs w:val="24"/>
+        </w:rPr>
+        <w:t xml:space="preserve"> receive an adjustment or credit. Inquiries should be directed </w:t>
+      </w:r>
+      <w:proofErr w:type="gramStart"/>
+      <w:r>
+        <w:rPr>
+          <w:sz w:val="24"/>
+          <w:szCs w:val="24"/>
+        </w:rPr>
+        <w:t>to Company’s</w:t>
+      </w:r>
+      <w:proofErr w:type="gramEnd"/>
+      <w:r>
+        <w:rPr>
+          <w:sz w:val="24"/>
+          <w:szCs w:val="24"/>
+        </w:rPr>
+        <w:t xml:space="preserve"> customer support department. Company may choose to bill through an invoice, in which case, full payment for invoices issued in any given month must be received by Company thirty (30) days after the mailing date of the invoice. Unpaid amounts are subject to a finance charge of 1.5% per month on any outstanding balance, or the maximum permitted by law, whichever is lower, plus all expenses of collection and may result in immediate termination of Service. Customer shall be responsible for all taxes associated with Services other than U.S. taxes based on Company’s net income.</w:t>
       </w:r>
     </w:p>
     <w:p>
@@ -1367,7 +1568,23 @@
           <w:sz w:val="24"/>
           <w:szCs w:val="24"/>
         </w:rPr>
-        <w:t>If Service implementation or migration project is being delayed due to customer not responding in a timely manner or due to other delays from Customer which are not communicated to the Company before the Effective Date, Company may charge additional fee as specified under Overage Charges.</w:t>
+        <w:t xml:space="preserve">If Service implementation or migration project is being delayed due to </w:t>
+      </w:r>
+      <w:proofErr w:type="gramStart"/>
+      <w:r>
+        <w:rPr>
+          <w:sz w:val="24"/>
+          <w:szCs w:val="24"/>
+        </w:rPr>
+        <w:t>customer</w:t>
+      </w:r>
+      <w:proofErr w:type="gramEnd"/>
+      <w:r>
+        <w:rPr>
+          <w:sz w:val="24"/>
+          <w:szCs w:val="24"/>
+        </w:rPr>
+        <w:t xml:space="preserve"> not responding in a timely manner or due to other delays from Customer which are not communicated to the Company before the Effective Date, Company may charge additional fee as specified under Overage Charges.</w:t>
       </w:r>
     </w:p>
     <w:p>
@@ -2086,7 +2303,23 @@
           <w:sz w:val="24"/>
           <w:szCs w:val="24"/>
         </w:rPr>
-        <w:t xml:space="preserve">(G) AMOUNTS ASSOCIATED WITH ALL OTHER CLAIMS, EXCEED THE FEES PAID BY CUSTOMER TO COMPANY FOR THE SERVICES UNDER THIS AGREEMENT IN THE 12 </w:t>
+        <w:t xml:space="preserve">(G) AMOUNTS ASSOCIATED WITH ALL OTHER </w:t>
+      </w:r>
+      <w:proofErr w:type="gramStart"/>
+      <w:r>
+        <w:rPr>
+          <w:sz w:val="24"/>
+          <w:szCs w:val="24"/>
+        </w:rPr>
+        <w:t>CLAIMS,</w:t>
+      </w:r>
+      <w:proofErr w:type="gramEnd"/>
+      <w:r>
+        <w:rPr>
+          <w:sz w:val="24"/>
+          <w:szCs w:val="24"/>
+        </w:rPr>
+        <w:t xml:space="preserve"> EXCEED THE FEES PAID BY CUSTOMER TO COMPANY FOR THE SERVICES UNDER THIS AGREEMENT IN THE 12 </w:t>
       </w:r>
       <w:r>
         <w:rPr>
@@ -2200,7 +2433,39 @@
           <w:sz w:val="24"/>
           <w:szCs w:val="24"/>
         </w:rPr>
-        <w:t>If any provision of this Agreement is found to be unenforceable or invalid, that provision will be limited or eliminated to the minimum extent necessary so that this Agreement will otherwise remain in full force and effect and enforceable. This Agreement is not assignable, transferable or sub-licensable by Customer except with Company’s prior written consent. Company may transfer and assign any of its rights and obligations under this Agreement without consent. This Agreement is the complete and exclusive statement of the mutual understanding of the parties and supersedes and cancels all previous written and oral agreements, communications and other understandings relating to the subject matter of this Agreement, and that all waivers and modifications must be in a writing signed by both parties, except as otherwise provided herein. No agency, partnership, joint venture, or employment is created as a result of this Agreement and Customer does not have any authority of any kind to bind Company in any respect whatsoever. In any action or proceeding to enforce rights under this Agreement, the prevailing party will be entitled to recover costs and attorneys’ fees. All notices under this Agreement will be in writing and will be deemed to have been duly given when received, if personally delivered; when receipt is electronically confirmed, if transmitted by facsimile or e-mail; the day after it is sent, if sent for next day delivery by recognized overnight delivery service; and upon receipt, if sent by certified or registered mail, return receipt requested. This Agreement shall be governed by the laws of the State of North Carolina without regard to its conflict of law's provisions. The parties shall work together in good faith to issue a least one mutually agreed upon press release within 90 days of the Effective Date, and Customer otherwise agrees to reasonably cooperate with Company to serve as a reference account up.</w:t>
+        <w:t xml:space="preserve">If any provision of this Agreement is found to be unenforceable or invalid, that provision will be limited or eliminated to the minimum extent necessary so that this Agreement will otherwise remain in full force and effect and enforceable. This Agreement is not assignable, transferable or sub-licensable by Customer except with Company’s prior written consent. Company may transfer and assign any of its rights and obligations under this Agreement without consent. This Agreement is the complete and exclusive statement of the mutual understanding of the parties and supersedes and cancels all previous written and oral agreements, communications and other understandings relating to the subject matter of this Agreement, and that all waivers and modifications must be in a writing signed by both parties, except as otherwise provided herein. No agency, partnership, joint venture, or employment is created </w:t>
+      </w:r>
+      <w:proofErr w:type="gramStart"/>
+      <w:r>
+        <w:rPr>
+          <w:sz w:val="24"/>
+          <w:szCs w:val="24"/>
+        </w:rPr>
+        <w:t>as a result of</w:t>
+      </w:r>
+      <w:proofErr w:type="gramEnd"/>
+      <w:r>
+        <w:rPr>
+          <w:sz w:val="24"/>
+          <w:szCs w:val="24"/>
+        </w:rPr>
+        <w:t xml:space="preserve"> this Agreement and Customer does not have any authority of any kind to bind Company in any respect whatsoever. In any action or proceeding to enforce rights under this Agreement, the prevailing party will be entitled to recover costs and attorneys’ fees. All notices under this Agreement will be in writing and will be deemed to have been duly given when received, if personally delivered; when receipt is electronically confirmed, if transmitted by facsimile or e-mail; the day after it is sent, if sent for next day delivery by recognized overnight delivery service; and upon receipt, if sent by certified or registered mail, return receipt requested. This Agreement shall be governed by the laws of the State of North Carolina without regard to its conflict of law's provisions. The parties shall work together in good faith to issue </w:t>
+      </w:r>
+      <w:proofErr w:type="gramStart"/>
+      <w:r>
+        <w:rPr>
+          <w:sz w:val="24"/>
+          <w:szCs w:val="24"/>
+        </w:rPr>
+        <w:t>a least</w:t>
+      </w:r>
+      <w:proofErr w:type="gramEnd"/>
+      <w:r>
+        <w:rPr>
+          <w:sz w:val="24"/>
+          <w:szCs w:val="24"/>
+        </w:rPr>
+        <w:t xml:space="preserve"> one mutually agreed upon press release within 90 days of the Effective Date, and Customer otherwise agrees to reasonably cooperate with Company to serve as a reference account up.</w:t>
       </w:r>
     </w:p>
     <w:p>
@@ -2268,7 +2533,23 @@
           <w:sz w:val="23"/>
           <w:szCs w:val="23"/>
         </w:rPr>
-        <w:t xml:space="preserve"> Technical support services shall be made available to the Customer during regular business hours in the Customer’s local time zone, unless otherwise mutually agreed upon in writing.</w:t>
+        <w:t xml:space="preserve"> Technical support services </w:t>
+      </w:r>
+      <w:proofErr w:type="gramStart"/>
+      <w:r>
+        <w:rPr>
+          <w:sz w:val="23"/>
+          <w:szCs w:val="23"/>
+        </w:rPr>
+        <w:t>shall</w:t>
+      </w:r>
+      <w:proofErr w:type="gramEnd"/>
+      <w:r>
+        <w:rPr>
+          <w:sz w:val="23"/>
+          <w:szCs w:val="23"/>
+        </w:rPr>
+        <w:t xml:space="preserve"> be made available to the Customer during regular business hours in the Customer’s local time zone, unless otherwise mutually agreed upon in writing.</w:t>
       </w:r>
     </w:p>
     <w:p>
@@ -2366,7 +2647,25 @@
           <w:sz w:val="23"/>
           <w:szCs w:val="23"/>
         </w:rPr>
-        <w:t>​CloudFuze shall, in collaboration with the Customer, undertake the necessary activities to onboard the key applications identified by the Customer:</w:t>
+        <w:t xml:space="preserve">​CloudFuze shall, in collaboration with the Customer, undertake the necessary activities to </w:t>
+      </w:r>
+      <w:proofErr w:type="gramStart"/>
+      <w:r>
+        <w:rPr>
+          <w:rFonts w:ascii="Helvetica" w:hAnsi="Helvetica" w:cs="Helvetica"/>
+          <w:sz w:val="23"/>
+          <w:szCs w:val="23"/>
+        </w:rPr>
+        <w:t>onboard</w:t>
+      </w:r>
+      <w:proofErr w:type="gramEnd"/>
+      <w:r>
+        <w:rPr>
+          <w:rFonts w:ascii="Helvetica" w:hAnsi="Helvetica" w:cs="Helvetica"/>
+          <w:sz w:val="23"/>
+          <w:szCs w:val="23"/>
+        </w:rPr>
+        <w:t xml:space="preserve"> the key applications identified by the Customer:</w:t>
       </w:r>
     </w:p>
     <w:p>

</xml_diff>